<commit_message>
Checkpoint onboarding and Studio UI work
</commit_message>
<xml_diff>
--- a/docs/music-city-customer-development-plan.docx
+++ b/docs/music-city-customer-development-plan.docx
@@ -1,6 +1,6 @@
 
 <file path=word/document.xml><?xml version="1.0" encoding="utf-8"?>
-<w:document xmlns:ns1="http://schemas.openxmlformats.org/markup-compatibility/2006" xmlns:w="http://schemas.openxmlformats.org/wordprocessingml/2006/main" ns1:Ignorable="w14 wp14 w15">
+<w:document xmlns:a="http://schemas.openxmlformats.org/drawingml/2006/main" xmlns:ns1="http://schemas.openxmlformats.org/markup-compatibility/2006" xmlns:pic="http://schemas.openxmlformats.org/drawingml/2006/picture" xmlns:r="http://schemas.openxmlformats.org/officeDocument/2006/relationships" xmlns:w="http://schemas.openxmlformats.org/wordprocessingml/2006/main" xmlns:wp="http://schemas.openxmlformats.org/drawingml/2006/wordprocessingDrawing" ns1:Ignorable="w14 wp14 w15">
   <w:body>
     <w:p>
       <w:pPr>
@@ -2722,6 +2722,825 @@
       <w:r>
         <w:rPr/>
         <w:t>Music City: Connecting music to the world.</w:t>
+      </w:r>
+    </w:p>
+    <w:p>
+      <w:pPr>
+        <w:pStyle w:val="Heading1"/>
+      </w:pPr>
+      <w:r>
+        <w:t>Product Walkthrough Screenshots</w:t>
+      </w:r>
+    </w:p>
+    <w:p>
+      <w:pPr>
+        <w:pStyle w:val="BodyText"/>
+      </w:pPr>
+      <w:r>
+        <w:t>The following screenshots document the planned customer journey from account creation and artist onboarding through music upload, publishing, catalogue management and listener discovery. Each image is embedded in this document.</w:t>
+      </w:r>
+    </w:p>
+    <w:p>
+      <w:pPr>
+        <w:pStyle w:val="Caption"/>
+      </w:pPr>
+      <w:r>
+        <w:t>Figure 1 — Music City landing page: visitors can start releasing music or explore the listening experience.</w:t>
+      </w:r>
+    </w:p>
+    <w:p>
+      <w:pPr>
+        <w:jc w:val="center"/>
+      </w:pPr>
+      <w:r>
+        <w:drawing>
+          <wp:inline>
+            <wp:extent cx="5700000" cy="3316113"/>
+            <wp:effectExtent l="0" t="0" r="0" b="0"/>
+            <wp:docPr id="1015" name="screenshot-01.png"/>
+            <a:graphic>
+              <a:graphicData uri="http://schemas.openxmlformats.org/drawingml/2006/picture">
+                <pic:pic>
+                  <pic:nvPicPr>
+                    <pic:cNvPr id="0" name="screenshot-01.png"/>
+                    <pic:cNvPicPr/>
+                  </pic:nvPicPr>
+                  <pic:blipFill>
+                    <a:blip r:embed="rId6"/>
+                    <a:stretch>
+                      <a:fillRect/>
+                    </a:stretch>
+                  </pic:blipFill>
+                  <pic:spPr>
+                    <a:xfrm>
+                      <a:off x="0" y="0"/>
+                      <a:ext cx="5700000" cy="3316113"/>
+                    </a:xfrm>
+                    <a:prstGeom prst="rect">
+                      <a:avLst/>
+                    </a:prstGeom>
+                  </pic:spPr>
+                </pic:pic>
+              </a:graphicData>
+            </a:graphic>
+          </wp:inline>
+        </w:drawing>
+      </w:r>
+    </w:p>
+    <w:p>
+      <w:pPr/>
+      <w:r>
+        <w:br w:type="page"/>
+        <w:t/>
+      </w:r>
+    </w:p>
+    <w:p>
+      <w:pPr>
+        <w:pStyle w:val="Caption"/>
+      </w:pPr>
+      <w:r>
+        <w:t>Figure 2 — Secure login: email verification confirms the user identity before onboarding.</w:t>
+      </w:r>
+    </w:p>
+    <w:p>
+      <w:pPr>
+        <w:jc w:val="center"/>
+      </w:pPr>
+      <w:r>
+        <w:drawing>
+          <wp:inline>
+            <wp:extent cx="5700000" cy="3316113"/>
+            <wp:effectExtent l="0" t="0" r="0" b="0"/>
+            <wp:docPr id="1015" name="screenshot-02.png"/>
+            <a:graphic>
+              <a:graphicData uri="http://schemas.openxmlformats.org/drawingml/2006/picture">
+                <pic:pic>
+                  <pic:nvPicPr>
+                    <pic:cNvPr id="0" name="screenshot-02.png"/>
+                    <pic:cNvPicPr/>
+                  </pic:nvPicPr>
+                  <pic:blipFill>
+                    <a:blip r:embed="rId7"/>
+                    <a:stretch>
+                      <a:fillRect/>
+                    </a:stretch>
+                  </pic:blipFill>
+                  <pic:spPr>
+                    <a:xfrm>
+                      <a:off x="0" y="0"/>
+                      <a:ext cx="5700000" cy="3316113"/>
+                    </a:xfrm>
+                    <a:prstGeom prst="rect">
+                      <a:avLst/>
+                    </a:prstGeom>
+                  </pic:spPr>
+                </pic:pic>
+              </a:graphicData>
+            </a:graphic>
+          </wp:inline>
+        </w:drawing>
+      </w:r>
+    </w:p>
+    <w:p>
+      <w:pPr/>
+      <w:r>
+        <w:br w:type="page"/>
+        <w:t/>
+      </w:r>
+    </w:p>
+    <w:p>
+      <w:pPr>
+        <w:pStyle w:val="Caption"/>
+      </w:pPr>
+      <w:r>
+        <w:t>Figure 3 — Onboarding step 1: the user enters a display name, email, account type and location.</w:t>
+      </w:r>
+    </w:p>
+    <w:p>
+      <w:pPr>
+        <w:jc w:val="center"/>
+      </w:pPr>
+      <w:r>
+        <w:drawing>
+          <wp:inline>
+            <wp:extent cx="5700000" cy="3316113"/>
+            <wp:effectExtent l="0" t="0" r="0" b="0"/>
+            <wp:docPr id="1015" name="screenshot-03.png"/>
+            <a:graphic>
+              <a:graphicData uri="http://schemas.openxmlformats.org/drawingml/2006/picture">
+                <pic:pic>
+                  <pic:nvPicPr>
+                    <pic:cNvPr id="0" name="screenshot-03.png"/>
+                    <pic:cNvPicPr/>
+                  </pic:nvPicPr>
+                  <pic:blipFill>
+                    <a:blip r:embed="rId8"/>
+                    <a:stretch>
+                      <a:fillRect/>
+                    </a:stretch>
+                  </pic:blipFill>
+                  <pic:spPr>
+                    <a:xfrm>
+                      <a:off x="0" y="0"/>
+                      <a:ext cx="5700000" cy="3316113"/>
+                    </a:xfrm>
+                    <a:prstGeom prst="rect">
+                      <a:avLst/>
+                    </a:prstGeom>
+                  </pic:spPr>
+                </pic:pic>
+              </a:graphicData>
+            </a:graphic>
+          </wp:inline>
+        </w:drawing>
+      </w:r>
+    </w:p>
+    <w:p>
+      <w:pPr/>
+      <w:r>
+        <w:br w:type="page"/>
+        <w:t/>
+      </w:r>
+    </w:p>
+    <w:p>
+      <w:pPr>
+        <w:pStyle w:val="Caption"/>
+      </w:pPr>
+      <w:r>
+        <w:t>Figure 4 — Onboarding step 2: the user can add a profile picture and header image.</w:t>
+      </w:r>
+    </w:p>
+    <w:p>
+      <w:pPr>
+        <w:jc w:val="center"/>
+      </w:pPr>
+      <w:r>
+        <w:drawing>
+          <wp:inline>
+            <wp:extent cx="5700000" cy="3316113"/>
+            <wp:effectExtent l="0" t="0" r="0" b="0"/>
+            <wp:docPr id="1015" name="screenshot-04.png"/>
+            <a:graphic>
+              <a:graphicData uri="http://schemas.openxmlformats.org/drawingml/2006/picture">
+                <pic:pic>
+                  <pic:nvPicPr>
+                    <pic:cNvPr id="0" name="screenshot-04.png"/>
+                    <pic:cNvPicPr/>
+                  </pic:nvPicPr>
+                  <pic:blipFill>
+                    <a:blip r:embed="rId9"/>
+                    <a:stretch>
+                      <a:fillRect/>
+                    </a:stretch>
+                  </pic:blipFill>
+                  <pic:spPr>
+                    <a:xfrm>
+                      <a:off x="0" y="0"/>
+                      <a:ext cx="5700000" cy="3316113"/>
+                    </a:xfrm>
+                    <a:prstGeom prst="rect">
+                      <a:avLst/>
+                    </a:prstGeom>
+                  </pic:spPr>
+                </pic:pic>
+              </a:graphicData>
+            </a:graphic>
+          </wp:inline>
+        </w:drawing>
+      </w:r>
+    </w:p>
+    <w:p>
+      <w:pPr/>
+      <w:r>
+        <w:br w:type="page"/>
+        <w:t/>
+      </w:r>
+    </w:p>
+    <w:p>
+      <w:pPr>
+        <w:pStyle w:val="Caption"/>
+      </w:pPr>
+      <w:r>
+        <w:t>Figure 5 — Artist studio: the creator can upload music, manage the catalogue, view releases and monitor performance.</w:t>
+      </w:r>
+    </w:p>
+    <w:p>
+      <w:pPr>
+        <w:jc w:val="center"/>
+      </w:pPr>
+      <w:r>
+        <w:drawing>
+          <wp:inline>
+            <wp:extent cx="5700000" cy="3316113"/>
+            <wp:effectExtent l="0" t="0" r="0" b="0"/>
+            <wp:docPr id="1015" name="screenshot-05.png"/>
+            <a:graphic>
+              <a:graphicData uri="http://schemas.openxmlformats.org/drawingml/2006/picture">
+                <pic:pic>
+                  <pic:nvPicPr>
+                    <pic:cNvPr id="0" name="screenshot-05.png"/>
+                    <pic:cNvPicPr/>
+                  </pic:nvPicPr>
+                  <pic:blipFill>
+                    <a:blip r:embed="rId10"/>
+                    <a:stretch>
+                      <a:fillRect/>
+                    </a:stretch>
+                  </pic:blipFill>
+                  <pic:spPr>
+                    <a:xfrm>
+                      <a:off x="0" y="0"/>
+                      <a:ext cx="5700000" cy="3316113"/>
+                    </a:xfrm>
+                    <a:prstGeom prst="rect">
+                      <a:avLst/>
+                    </a:prstGeom>
+                  </pic:spPr>
+                </pic:pic>
+              </a:graphicData>
+            </a:graphic>
+          </wp:inline>
+        </w:drawing>
+      </w:r>
+    </w:p>
+    <w:p>
+      <w:pPr/>
+      <w:r>
+        <w:br w:type="page"/>
+        <w:t/>
+      </w:r>
+    </w:p>
+    <w:p>
+      <w:pPr>
+        <w:pStyle w:val="Caption"/>
+      </w:pPr>
+      <w:r>
+        <w:t>Figure 6 — Upload wizard, step 1: the artist enters track basics, artist identity, genre, country and release placement.</w:t>
+      </w:r>
+    </w:p>
+    <w:p>
+      <w:pPr>
+        <w:jc w:val="center"/>
+      </w:pPr>
+      <w:r>
+        <w:drawing>
+          <wp:inline>
+            <wp:extent cx="5700000" cy="3316113"/>
+            <wp:effectExtent l="0" t="0" r="0" b="0"/>
+            <wp:docPr id="1015" name="screenshot-06.png"/>
+            <a:graphic>
+              <a:graphicData uri="http://schemas.openxmlformats.org/drawingml/2006/picture">
+                <pic:pic>
+                  <pic:nvPicPr>
+                    <pic:cNvPr id="0" name="screenshot-06.png"/>
+                    <pic:cNvPicPr/>
+                  </pic:nvPicPr>
+                  <pic:blipFill>
+                    <a:blip r:embed="rId11"/>
+                    <a:stretch>
+                      <a:fillRect/>
+                    </a:stretch>
+                  </pic:blipFill>
+                  <pic:spPr>
+                    <a:xfrm>
+                      <a:off x="0" y="0"/>
+                      <a:ext cx="5700000" cy="3316113"/>
+                    </a:xfrm>
+                    <a:prstGeom prst="rect">
+                      <a:avLst/>
+                    </a:prstGeom>
+                  </pic:spPr>
+                </pic:pic>
+              </a:graphicData>
+            </a:graphic>
+          </wp:inline>
+        </w:drawing>
+      </w:r>
+    </w:p>
+    <w:p>
+      <w:pPr/>
+      <w:r>
+        <w:br w:type="page"/>
+        <w:t/>
+      </w:r>
+    </w:p>
+    <w:p>
+      <w:pPr>
+        <w:pStyle w:val="Caption"/>
+      </w:pPr>
+      <w:r>
+        <w:t>Figure 7 — Upload wizard, step 2: credits and rights information are captured for the release.</w:t>
+      </w:r>
+    </w:p>
+    <w:p>
+      <w:pPr>
+        <w:jc w:val="center"/>
+      </w:pPr>
+      <w:r>
+        <w:drawing>
+          <wp:inline>
+            <wp:extent cx="5700000" cy="3316113"/>
+            <wp:effectExtent l="0" t="0" r="0" b="0"/>
+            <wp:docPr id="1015" name="screenshot-07.png"/>
+            <a:graphic>
+              <a:graphicData uri="http://schemas.openxmlformats.org/drawingml/2006/picture">
+                <pic:pic>
+                  <pic:nvPicPr>
+                    <pic:cNvPr id="0" name="screenshot-07.png"/>
+                    <pic:cNvPicPr/>
+                  </pic:nvPicPr>
+                  <pic:blipFill>
+                    <a:blip r:embed="rId12"/>
+                    <a:stretch>
+                      <a:fillRect/>
+                    </a:stretch>
+                  </pic:blipFill>
+                  <pic:spPr>
+                    <a:xfrm>
+                      <a:off x="0" y="0"/>
+                      <a:ext cx="5700000" cy="3316113"/>
+                    </a:xfrm>
+                    <a:prstGeom prst="rect">
+                      <a:avLst/>
+                    </a:prstGeom>
+                  </pic:spPr>
+                </pic:pic>
+              </a:graphicData>
+            </a:graphic>
+          </wp:inline>
+        </w:drawing>
+      </w:r>
+    </w:p>
+    <w:p>
+      <w:pPr/>
+      <w:r>
+        <w:br w:type="page"/>
+        <w:t/>
+      </w:r>
+    </w:p>
+    <w:p>
+      <w:pPr>
+        <w:pStyle w:val="Caption"/>
+      </w:pPr>
+      <w:r>
+        <w:t>Figure 8 — Upload wizard, step 3: the artist adds cover artwork and the audio master.</w:t>
+      </w:r>
+    </w:p>
+    <w:p>
+      <w:pPr>
+        <w:jc w:val="center"/>
+      </w:pPr>
+      <w:r>
+        <w:drawing>
+          <wp:inline>
+            <wp:extent cx="5700000" cy="3316113"/>
+            <wp:effectExtent l="0" t="0" r="0" b="0"/>
+            <wp:docPr id="1015" name="screenshot-08.png"/>
+            <a:graphic>
+              <a:graphicData uri="http://schemas.openxmlformats.org/drawingml/2006/picture">
+                <pic:pic>
+                  <pic:nvPicPr>
+                    <pic:cNvPr id="0" name="screenshot-08.png"/>
+                    <pic:cNvPicPr/>
+                  </pic:nvPicPr>
+                  <pic:blipFill>
+                    <a:blip r:embed="rId13"/>
+                    <a:stretch>
+                      <a:fillRect/>
+                    </a:stretch>
+                  </pic:blipFill>
+                  <pic:spPr>
+                    <a:xfrm>
+                      <a:off x="0" y="0"/>
+                      <a:ext cx="5700000" cy="3316113"/>
+                    </a:xfrm>
+                    <a:prstGeom prst="rect">
+                      <a:avLst/>
+                    </a:prstGeom>
+                  </pic:spPr>
+                </pic:pic>
+              </a:graphicData>
+            </a:graphic>
+          </wp:inline>
+        </w:drawing>
+      </w:r>
+    </w:p>
+    <w:p>
+      <w:pPr/>
+      <w:r>
+        <w:br w:type="page"/>
+        <w:t/>
+      </w:r>
+    </w:p>
+    <w:p>
+      <w:pPr>
+        <w:pStyle w:val="Caption"/>
+      </w:pPr>
+      <w:r>
+        <w:t>Figure 9 — Upload wizard, step 4: the artist chooses whether to publish the track or keep it unpublished.</w:t>
+      </w:r>
+    </w:p>
+    <w:p>
+      <w:pPr>
+        <w:jc w:val="center"/>
+      </w:pPr>
+      <w:r>
+        <w:drawing>
+          <wp:inline>
+            <wp:extent cx="5700000" cy="3316113"/>
+            <wp:effectExtent l="0" t="0" r="0" b="0"/>
+            <wp:docPr id="1015" name="screenshot-09.png"/>
+            <a:graphic>
+              <a:graphicData uri="http://schemas.openxmlformats.org/drawingml/2006/picture">
+                <pic:pic>
+                  <pic:nvPicPr>
+                    <pic:cNvPr id="0" name="screenshot-09.png"/>
+                    <pic:cNvPicPr/>
+                  </pic:nvPicPr>
+                  <pic:blipFill>
+                    <a:blip r:embed="rId14"/>
+                    <a:stretch>
+                      <a:fillRect/>
+                    </a:stretch>
+                  </pic:blipFill>
+                  <pic:spPr>
+                    <a:xfrm>
+                      <a:off x="0" y="0"/>
+                      <a:ext cx="5700000" cy="3316113"/>
+                    </a:xfrm>
+                    <a:prstGeom prst="rect">
+                      <a:avLst/>
+                    </a:prstGeom>
+                  </pic:spPr>
+                </pic:pic>
+              </a:graphicData>
+            </a:graphic>
+          </wp:inline>
+        </w:drawing>
+      </w:r>
+    </w:p>
+    <w:p>
+      <w:pPr/>
+      <w:r>
+        <w:br w:type="page"/>
+        <w:t/>
+      </w:r>
+    </w:p>
+    <w:p>
+      <w:pPr>
+        <w:pStyle w:val="Caption"/>
+      </w:pPr>
+      <w:r>
+        <w:t>Figure 10 — Track catalogue: the artist reviews playback readiness, manages tracks and opens release tools.</w:t>
+      </w:r>
+    </w:p>
+    <w:p>
+      <w:pPr>
+        <w:jc w:val="center"/>
+      </w:pPr>
+      <w:r>
+        <w:drawing>
+          <wp:inline>
+            <wp:extent cx="5700000" cy="3316113"/>
+            <wp:effectExtent l="0" t="0" r="0" b="0"/>
+            <wp:docPr id="1015" name="screenshot-10.png"/>
+            <a:graphic>
+              <a:graphicData uri="http://schemas.openxmlformats.org/drawingml/2006/picture">
+                <pic:pic>
+                  <pic:nvPicPr>
+                    <pic:cNvPr id="0" name="screenshot-10.png"/>
+                    <pic:cNvPicPr/>
+                  </pic:nvPicPr>
+                  <pic:blipFill>
+                    <a:blip r:embed="rId15"/>
+                    <a:stretch>
+                      <a:fillRect/>
+                    </a:stretch>
+                  </pic:blipFill>
+                  <pic:spPr>
+                    <a:xfrm>
+                      <a:off x="0" y="0"/>
+                      <a:ext cx="5700000" cy="3316113"/>
+                    </a:xfrm>
+                    <a:prstGeom prst="rect">
+                      <a:avLst/>
+                    </a:prstGeom>
+                  </pic:spPr>
+                </pic:pic>
+              </a:graphicData>
+            </a:graphic>
+          </wp:inline>
+        </w:drawing>
+      </w:r>
+    </w:p>
+    <w:p>
+      <w:pPr/>
+      <w:r>
+        <w:br w:type="page"/>
+        <w:t/>
+      </w:r>
+    </w:p>
+    <w:p>
+      <w:pPr>
+        <w:pStyle w:val="Caption"/>
+      </w:pPr>
+      <w:r>
+        <w:t>Figure 11 — Track catalogue with playback: the creator can preview the uploaded track from the studio.</w:t>
+      </w:r>
+    </w:p>
+    <w:p>
+      <w:pPr>
+        <w:jc w:val="center"/>
+      </w:pPr>
+      <w:r>
+        <w:drawing>
+          <wp:inline>
+            <wp:extent cx="5700000" cy="3316113"/>
+            <wp:effectExtent l="0" t="0" r="0" b="0"/>
+            <wp:docPr id="1015" name="screenshot-11.png"/>
+            <a:graphic>
+              <a:graphicData uri="http://schemas.openxmlformats.org/drawingml/2006/picture">
+                <pic:pic>
+                  <pic:nvPicPr>
+                    <pic:cNvPr id="0" name="screenshot-11.png"/>
+                    <pic:cNvPicPr/>
+                  </pic:nvPicPr>
+                  <pic:blipFill>
+                    <a:blip r:embed="rId16"/>
+                    <a:stretch>
+                      <a:fillRect/>
+                    </a:stretch>
+                  </pic:blipFill>
+                  <pic:spPr>
+                    <a:xfrm>
+                      <a:off x="0" y="0"/>
+                      <a:ext cx="5700000" cy="3316113"/>
+                    </a:xfrm>
+                    <a:prstGeom prst="rect">
+                      <a:avLst/>
+                    </a:prstGeom>
+                  </pic:spPr>
+                </pic:pic>
+              </a:graphicData>
+            </a:graphic>
+          </wp:inline>
+        </w:drawing>
+      </w:r>
+    </w:p>
+    <w:p>
+      <w:pPr/>
+      <w:r>
+        <w:br w:type="page"/>
+        <w:t/>
+      </w:r>
+    </w:p>
+    <w:p>
+      <w:pPr>
+        <w:pStyle w:val="Caption"/>
+      </w:pPr>
+      <w:r>
+        <w:t>Figure 12 — Discover page: listeners browse featured tracks and currently playing music.</w:t>
+      </w:r>
+    </w:p>
+    <w:p>
+      <w:pPr>
+        <w:jc w:val="center"/>
+      </w:pPr>
+      <w:r>
+        <w:drawing>
+          <wp:inline>
+            <wp:extent cx="5700000" cy="3316113"/>
+            <wp:effectExtent l="0" t="0" r="0" b="0"/>
+            <wp:docPr id="1015" name="screenshot-12.png"/>
+            <a:graphic>
+              <a:graphicData uri="http://schemas.openxmlformats.org/drawingml/2006/picture">
+                <pic:pic>
+                  <pic:nvPicPr>
+                    <pic:cNvPr id="0" name="screenshot-12.png"/>
+                    <pic:cNvPicPr/>
+                  </pic:nvPicPr>
+                  <pic:blipFill>
+                    <a:blip r:embed="rId17"/>
+                    <a:stretch>
+                      <a:fillRect/>
+                    </a:stretch>
+                  </pic:blipFill>
+                  <pic:spPr>
+                    <a:xfrm>
+                      <a:off x="0" y="0"/>
+                      <a:ext cx="5700000" cy="3316113"/>
+                    </a:xfrm>
+                    <a:prstGeom prst="rect">
+                      <a:avLst/>
+                    </a:prstGeom>
+                  </pic:spPr>
+                </pic:pic>
+              </a:graphicData>
+            </a:graphic>
+          </wp:inline>
+        </w:drawing>
+      </w:r>
+    </w:p>
+    <w:p>
+      <w:pPr/>
+      <w:r>
+        <w:br w:type="page"/>
+        <w:t/>
+      </w:r>
+    </w:p>
+    <w:p>
+      <w:pPr>
+        <w:pStyle w:val="Caption"/>
+      </w:pPr>
+      <w:r>
+        <w:t>Figure 13 — Discover results: listeners can browse featured tracks, play music and explore community playlists.</w:t>
+      </w:r>
+    </w:p>
+    <w:p>
+      <w:pPr>
+        <w:jc w:val="center"/>
+      </w:pPr>
+      <w:r>
+        <w:drawing>
+          <wp:inline>
+            <wp:extent cx="5700000" cy="3316113"/>
+            <wp:effectExtent l="0" t="0" r="0" b="0"/>
+            <wp:docPr id="1015" name="screenshot-13.png"/>
+            <a:graphic>
+              <a:graphicData uri="http://schemas.openxmlformats.org/drawingml/2006/picture">
+                <pic:pic>
+                  <pic:nvPicPr>
+                    <pic:cNvPr id="0" name="screenshot-13.png"/>
+                    <pic:cNvPicPr/>
+                  </pic:nvPicPr>
+                  <pic:blipFill>
+                    <a:blip r:embed="rId18"/>
+                    <a:stretch>
+                      <a:fillRect/>
+                    </a:stretch>
+                  </pic:blipFill>
+                  <pic:spPr>
+                    <a:xfrm>
+                      <a:off x="0" y="0"/>
+                      <a:ext cx="5700000" cy="3316113"/>
+                    </a:xfrm>
+                    <a:prstGeom prst="rect">
+                      <a:avLst/>
+                    </a:prstGeom>
+                  </pic:spPr>
+                </pic:pic>
+              </a:graphicData>
+            </a:graphic>
+          </wp:inline>
+        </w:drawing>
+      </w:r>
+    </w:p>
+    <w:p>
+      <w:pPr/>
+      <w:r>
+        <w:br w:type="page"/>
+        <w:t/>
+      </w:r>
+    </w:p>
+    <w:p>
+      <w:pPr>
+        <w:pStyle w:val="Caption"/>
+      </w:pPr>
+      <w:r>
+        <w:t>Appendix Figure A — Ambassador network table with one ambassador per row and artist counts.</w:t>
+      </w:r>
+    </w:p>
+    <w:p>
+      <w:pPr>
+        <w:jc w:val="center"/>
+      </w:pPr>
+      <w:r>
+        <w:drawing>
+          <wp:inline>
+            <wp:extent cx="5700000" cy="3807723"/>
+            <wp:effectExtent l="0" t="0" r="0" b="0"/>
+            <wp:docPr id="1015" name="screenshot-14.png"/>
+            <a:graphic>
+              <a:graphicData uri="http://schemas.openxmlformats.org/drawingml/2006/picture">
+                <pic:pic>
+                  <pic:nvPicPr>
+                    <pic:cNvPr id="0" name="screenshot-14.png"/>
+                    <pic:cNvPicPr/>
+                  </pic:nvPicPr>
+                  <pic:blipFill>
+                    <a:blip r:embed="rId19"/>
+                    <a:stretch>
+                      <a:fillRect/>
+                    </a:stretch>
+                  </pic:blipFill>
+                  <pic:spPr>
+                    <a:xfrm>
+                      <a:off x="0" y="0"/>
+                      <a:ext cx="5700000" cy="3807723"/>
+                    </a:xfrm>
+                    <a:prstGeom prst="rect">
+                      <a:avLst/>
+                    </a:prstGeom>
+                  </pic:spPr>
+                </pic:pic>
+              </a:graphicData>
+            </a:graphic>
+          </wp:inline>
+        </w:drawing>
+      </w:r>
+    </w:p>
+    <w:p>
+      <w:pPr/>
+      <w:r>
+        <w:br w:type="page"/>
+        <w:t/>
+      </w:r>
+    </w:p>
+    <w:p>
+      <w:pPr>
+        <w:pStyle w:val="Caption"/>
+      </w:pPr>
+      <w:r>
+        <w:t>Appendix Figure B — Ambassador network table showing the market, ambassador and artist-count columns.</w:t>
+      </w:r>
+    </w:p>
+    <w:p>
+      <w:pPr>
+        <w:jc w:val="center"/>
+      </w:pPr>
+      <w:r>
+        <w:drawing>
+          <wp:inline>
+            <wp:extent cx="5700000" cy="2757467"/>
+            <wp:effectExtent l="0" t="0" r="0" b="0"/>
+            <wp:docPr id="1015" name="screenshot-15.png"/>
+            <a:graphic>
+              <a:graphicData uri="http://schemas.openxmlformats.org/drawingml/2006/picture">
+                <pic:pic>
+                  <pic:nvPicPr>
+                    <pic:cNvPr id="0" name="screenshot-15.png"/>
+                    <pic:cNvPicPr/>
+                  </pic:nvPicPr>
+                  <pic:blipFill>
+                    <a:blip r:embed="rId20"/>
+                    <a:stretch>
+                      <a:fillRect/>
+                    </a:stretch>
+                  </pic:blipFill>
+                  <pic:spPr>
+                    <a:xfrm>
+                      <a:off x="0" y="0"/>
+                      <a:ext cx="5700000" cy="2757467"/>
+                    </a:xfrm>
+                    <a:prstGeom prst="rect">
+                      <a:avLst/>
+                    </a:prstGeom>
+                  </pic:spPr>
+                </pic:pic>
+              </a:graphicData>
+            </a:graphic>
+          </wp:inline>
+        </w:drawing>
       </w:r>
     </w:p>
     <w:sectPr>

</xml_diff>